<commit_message>
SHIPPED (task304): the van works with Fenwold Recovery's new entrants in 2027, about 70 started on hepatitis C treatment; needle exchanges next at 50
Architecture 3: the van's 2027 pool after two changes no file states as a pool. The pharmacies start their own test-and-
treat on 1 April 2027 (PH-12), sized from the three pharmacies already running it (a 0.025 yield against 0.168), and the
2026 van pilot already swept the hostels' standing residents (737 of 905 tested). Carrying 2026 forward files the
needle exchanges at 130; the rollout alone files the hostels; the sweep alone keeps the needle exchanges; both together
file Fenwold Recovery. The ask counts confirmed cures by clinic and half-year from the last dose dispensing records.
Gates: 109 checks, verify 35, byte-identical builds, figures_check 63, precut 53 clean, leak reader clean, determinism
judge DETERMINISTIC APPROVE, heart WARN, pair ceiling 28.5.

Co-Authored-By: Claude Opus 5.5 <noreply@anthropic.com>
</commit_message>
<xml_diff>
--- a/task304/golden/van_2027_trustee_paper.docx
+++ b/task304/golden/van_2027_trustee_paper.docx
@@ -8,16 +8,16 @@
           <w:b/>
           <w:sz w:val="28"/>
         </w:rPr>
-        <w:t>Find-and-treat van 2027: the needle exchange's new registrants</w:t>
+        <w:t>Find-and-treat van 2027: Fenwold Recovery's new entrants</w:t>
       </w:r>
     </w:p>
     <w:p>
       <w:r>
         <w:rPr>
           <w:color w:val="555555"/>
-          <w:sz w:val="17"/>
+          <w:sz w:val="16"/>
         </w:rPr>
-        <w:t>For decision. From Katie Reynolds, Director of Services, to the trustees' meeting of 12 November 2026. This paper completes the van plan of 6 October with the figures for the four settings.</w:t>
+        <w:t>For decision. From Stephanie Davis, Director of Services, to the trustees' meeting of 12 November 2026. This paper completes the outreach team's plan of 6 October with the figures for the four settings.</w:t>
       </w:r>
     </w:p>
     <w:p>
@@ -25,12 +25,17 @@
         <w:rPr>
           <w:b/>
         </w:rPr>
-        <w:t>Recommendation: the van works the needle exchange pharmacies' new registrants in 2027. It would start about 50 people on hepatitis C treatment there, 20 more than at Fenwold Recovery's new entrants, the next best at about 30.</w:t>
+        <w:t>Recommendation: the van works with Fenwold Recovery's new entrants in 2027. It would start about 70 people on hepatitis C treatment there, 20 more than at the needle exchange pharmacies' new registrants, the next best at about 50.</w:t>
       </w:r>
     </w:p>
     <w:p>
       <w:r>
-        <w:t>For every person the peer team found antibody positive among each setting's arrivals in the last two years, we looked at whether they still had an active infection when they were tested, from every record of their testing and treatment: the network's treatment register, Fenwold Pathology's results and Corvane Health's prison course workbook. An antibody test stays reactive after a cure, so a positive kit alone does not tell us who the van can treat. A quarter of approved premises arrivals test antibody positive, but more than half of those positives had already been cured inside prison before they arrived, and the van would start about 10 people there. The needle exchange's new registrants are the people least reached by treatment so far, and most of their positives still have an active infection.</w:t>
+        <w:t>The 2026 rota found the most active infections per test at the needle exchange pharmacies and in the hostels, and a year that repeated 2026 would put the van at the pharmacies. 2027 will not repeat 2026 in either place. From 1 April 2027 the integrated care board commissions pharmacist test and treat at every needle exchange pharmacy (its 2027/28 intentions, PH-12). Three pharmacies, Gorse Street, Halden and Morrow &amp; Pike, have done it since 2025, and there the van found 3 people with an active infection in 120 tests, against 0.168 per test at the other 21. From April every pharmacy will look like those three.</w:t>
+      </w:r>
+    </w:p>
+    <w:p>
+      <w:r>
+        <w:t>The hostels' figure in 2026 came from a first round. The van tested 737 of the 905 people on the hostels' 30 September lists and found 89 of them with an active infection, whom it does not test again, so in 2027 it would meet the other 648 with a negative test behind them; the infections still to find sit with the 168 residents it has not tested and the 264 people who arrive in a year. Fenwold Recovery's new entrants are a steady flow of people the van has not met, so the 2026 rates hold there.</w:t>
       </w:r>
     </w:p>
     <w:p>
@@ -94,6 +99,44 @@
           </w:tcPr>
           <w:p>
             <w:r>
+              <w:t>Fenwold Recovery new entrants</w:t>
+            </w:r>
+          </w:p>
+        </w:tc>
+        <w:tc>
+          <w:tcPr>
+            <w:tcW w:type="dxa" w:w="3286"/>
+          </w:tcPr>
+          <w:p>
+            <w:pPr>
+              <w:jc w:val="right"/>
+            </w:pPr>
+            <w:r>
+              <w:t>110</w:t>
+            </w:r>
+          </w:p>
+        </w:tc>
+        <w:tc>
+          <w:tcPr>
+            <w:tcW w:type="dxa" w:w="3286"/>
+          </w:tcPr>
+          <w:p>
+            <w:pPr>
+              <w:jc w:val="right"/>
+            </w:pPr>
+            <w:r>
+              <w:t>70</w:t>
+            </w:r>
+          </w:p>
+        </w:tc>
+      </w:tr>
+      <w:tr>
+        <w:tc>
+          <w:tcPr>
+            <w:tcW w:type="dxa" w:w="3286"/>
+          </w:tcPr>
+          <w:p>
+            <w:r>
               <w:t>Needle exchange new registrants</w:t>
             </w:r>
           </w:p>
@@ -132,7 +175,45 @@
           </w:tcPr>
           <w:p>
             <w:r>
-              <w:t>Fenwold Recovery new entrants</w:t>
+              <w:t>City hostels</w:t>
+            </w:r>
+          </w:p>
+        </w:tc>
+        <w:tc>
+          <w:tcPr>
+            <w:tcW w:type="dxa" w:w="3286"/>
+          </w:tcPr>
+          <w:p>
+            <w:pPr>
+              <w:jc w:val="right"/>
+            </w:pPr>
+            <w:r>
+              <w:t>50</w:t>
+            </w:r>
+          </w:p>
+        </w:tc>
+        <w:tc>
+          <w:tcPr>
+            <w:tcW w:type="dxa" w:w="3286"/>
+          </w:tcPr>
+          <w:p>
+            <w:pPr>
+              <w:jc w:val="right"/>
+            </w:pPr>
+            <w:r>
+              <w:t>40</w:t>
+            </w:r>
+          </w:p>
+        </w:tc>
+      </w:tr>
+      <w:tr>
+        <w:tc>
+          <w:tcPr>
+            <w:tcW w:type="dxa" w:w="3286"/>
+          </w:tcPr>
+          <w:p>
+            <w:r>
+              <w:t>Approved premises</w:t>
             </w:r>
           </w:p>
         </w:tc>
@@ -158,83 +239,7 @@
               <w:jc w:val="right"/>
             </w:pPr>
             <w:r>
-              <w:t>30</w:t>
-            </w:r>
-          </w:p>
-        </w:tc>
-      </w:tr>
-      <w:tr>
-        <w:tc>
-          <w:tcPr>
-            <w:tcW w:type="dxa" w:w="3286"/>
-          </w:tcPr>
-          <w:p>
-            <w:r>
-              <w:t>City hostels</w:t>
-            </w:r>
-          </w:p>
-        </w:tc>
-        <w:tc>
-          <w:tcPr>
-            <w:tcW w:type="dxa" w:w="3286"/>
-          </w:tcPr>
-          <w:p>
-            <w:pPr>
-              <w:jc w:val="right"/>
-            </w:pPr>
-            <w:r>
-              <w:t>30</w:t>
-            </w:r>
-          </w:p>
-        </w:tc>
-        <w:tc>
-          <w:tcPr>
-            <w:tcW w:type="dxa" w:w="3286"/>
-          </w:tcPr>
-          <w:p>
-            <w:pPr>
-              <w:jc w:val="right"/>
-            </w:pPr>
-            <w:r>
               <w:t>20</w:t>
-            </w:r>
-          </w:p>
-        </w:tc>
-      </w:tr>
-      <w:tr>
-        <w:tc>
-          <w:tcPr>
-            <w:tcW w:type="dxa" w:w="3286"/>
-          </w:tcPr>
-          <w:p>
-            <w:r>
-              <w:t>Approved premises</w:t>
-            </w:r>
-          </w:p>
-        </w:tc>
-        <w:tc>
-          <w:tcPr>
-            <w:tcW w:type="dxa" w:w="3286"/>
-          </w:tcPr>
-          <w:p>
-            <w:pPr>
-              <w:jc w:val="right"/>
-            </w:pPr>
-            <w:r>
-              <w:t>10</w:t>
-            </w:r>
-          </w:p>
-        </w:tc>
-        <w:tc>
-          <w:tcPr>
-            <w:tcW w:type="dxa" w:w="3286"/>
-          </w:tcPr>
-          <w:p>
-            <w:pPr>
-              <w:jc w:val="right"/>
-            </w:pPr>
-            <w:r>
-              <w:t>10</w:t>
             </w:r>
           </w:p>
         </w:tc>
@@ -246,7 +251,7 @@
           <w:color w:val="555555"/>
           <w:sz w:val="16"/>
         </w:rPr>
-        <w:t>People, rounded to the nearest 10; the unrounded figures are in the workbook. Sources: the settings' arrival returns and the peer testing log, October 2024 to September 2026; Fenwold Pathology; the network's treatment register; Corvane Health's course workbook; the 2018-19 pilot caseload.</w:t>
+        <w:t>People, rounded to the nearest 10. Sources: the van's tablet export and the network's treatment register for 2026; the settings' returns, the hostels' resident lists and the pharmacies' registrations for the twelve months to September 2026; Fenwold Pathology for new infections among hostel residents.</w:t>
       </w:r>
     </w:p>
     <w:p>
@@ -303,12 +308,16 @@
     </w:p>
     <w:p>
       <w:r>
-        <w:t>A 2027 year is each setting's average yearly arrivals in the two years to September 2026, each person counted once in a year. The van tests 65 per cent of arrivals and starts 74 per cent of the people it finds with an active infection within twelve weeks, as in the 2018-19 pilot. For every arrival the peer team found antibody positive in those two years we took their status at the time of the test: cured where a course had a twelve-week test not detected and no later RNA was found, not counted where a course was still running, and otherwise the latest RNA result, including prison reception tests. Where no record says anything we used the 74 per cent of first positives Fenwold Pathology finds with RNA detected.</w:t>
+        <w:t>Each setting's pool follows the plan: residents on 30 September 2026 and the arrivals of the twelve months to September, month for month. Each setting keeps the van's own 2026 share of people offered who took a test and of people found who started within twelve weeks, the latter over people found by 8 July 2026, the last day with twelve weeks of follow-up. At the pharmacies, January to March 2027 is at each pharmacy's own 2026 rate and April to December at the three test-and-treat pharmacies' rate. In the hostels, untested residents and arrivals are at the 2026 rate and the 648 residents who tested negative at the homeless health clinic's rate of new infection, 2 in 1,559 person-years.</w:t>
       </w:r>
     </w:p>
     <w:p>
       <w:r>
-        <w:t>People released from prison part-way through a course are carried by the van to the end of it but, as the plan sets out, are counted neither among the infections found nor among the starts. The nurse would carry well under the 70 courses she can hold at once in any of the four settings. Clinic outcomes for the network's last full year, October 2024 to September 2025, are in the workbook.</w:t>
+        <w:rPr>
+          <w:color w:val="555555"/>
+          <w:sz w:val="16"/>
+        </w:rPr>
+        <w:t>Clinic outcomes for October 2024 to September 2025 are in the clinic cures workbook.</w:t>
       </w:r>
     </w:p>
     <w:sectPr>

</xml_diff>